<commit_message>
File structure refactoring and thank you paged + Json data saving finished
</commit_message>
<xml_diff>
--- a/YFF-rapport - Re-Spawn prosjektet.docx
+++ b/YFF-rapport - Re-Spawn prosjektet.docx
@@ -333,21 +333,21 @@
                 <w:rFonts w:eastAsia="Times New Roman" w:cstheme="minorHAnsi"/>
                 <w:lang w:eastAsia="nb-NO"/>
               </w:rPr>
-              <w:t xml:space="preserve"> en PC med Visual Studio Code </w:t>
-            </w:r>
-            <w:r>
-              <w:rPr>
-                <w:rFonts w:eastAsia="Times New Roman" w:cstheme="minorHAnsi"/>
-                <w:lang w:eastAsia="nb-NO"/>
-              </w:rPr>
-              <w:t>(Med Live Server</w:t>
-            </w:r>
-            <w:r>
-              <w:rPr>
-                <w:rFonts w:eastAsia="Times New Roman" w:cstheme="minorHAnsi"/>
-                <w:lang w:eastAsia="nb-NO"/>
-              </w:rPr>
-              <w:t>), nettleser</w:t>
+              <w:t xml:space="preserve"> en PC med Visual Studio Code</w:t>
+            </w:r>
+            <w:r>
+              <w:rPr>
+                <w:rFonts w:eastAsia="Times New Roman" w:cstheme="minorHAnsi"/>
+                <w:lang w:eastAsia="nb-NO"/>
+              </w:rPr>
+              <w:t xml:space="preserve">, </w:t>
+            </w:r>
+            <w:r>
+              <w:rPr>
+                <w:rFonts w:eastAsia="Times New Roman" w:cstheme="minorHAnsi"/>
+                <w:lang w:eastAsia="nb-NO"/>
+              </w:rPr>
+              <w:t>nettleser</w:t>
             </w:r>
             <w:r>
               <w:rPr>
@@ -2793,40 +2793,7 @@
           <w:sz w:val="20"/>
           <w:szCs w:val="20"/>
         </w:rPr>
-        <w:t xml:space="preserve"> </w:t>
-      </w:r>
-      <w:r>
-        <w:rPr>
-          <w:rStyle w:val="normaltextrun"/>
-          <w:rFonts w:ascii="Calibri" w:hAnsi="Calibri" w:cs="Calibri"/>
-          <w:i/>
-          <w:iCs/>
-          <w:sz w:val="20"/>
-          <w:szCs w:val="20"/>
-        </w:rPr>
-        <w:t>(</w:t>
-      </w:r>
-      <w:r>
-        <w:rPr>
-          <w:rStyle w:val="normaltextrun"/>
-          <w:rFonts w:ascii="Calibri" w:hAnsi="Calibri" w:cs="Calibri"/>
-          <w:i/>
-          <w:iCs/>
-          <w:sz w:val="20"/>
-          <w:szCs w:val="20"/>
-        </w:rPr>
-        <w:t>H</w:t>
-      </w:r>
-      <w:r>
-        <w:rPr>
-          <w:rStyle w:val="normaltextrun"/>
-          <w:rFonts w:ascii="Calibri" w:hAnsi="Calibri" w:cs="Calibri"/>
-          <w:i/>
-          <w:iCs/>
-          <w:sz w:val="20"/>
-          <w:szCs w:val="20"/>
-        </w:rPr>
-        <w:t>jemme siden er der bare for å være der liksom…)</w:t>
+        <w:t xml:space="preserve"> (Hjemme siden er der bare for å være der liksom…)</w:t>
       </w:r>
     </w:p>
     <w:p>
@@ -2978,29 +2945,7 @@
             <w:sz w:val="20"/>
             <w:szCs w:val="20"/>
           </w:rPr>
-          <w:t>https://workbin.de</w:t>
-        </w:r>
-        <w:r>
-          <w:rPr>
-            <w:rStyle w:val="Hyperlink"/>
-            <w:rFonts w:asciiTheme="minorHAnsi" w:hAnsiTheme="minorHAnsi" w:cstheme="minorHAnsi"/>
-            <w:i/>
-            <w:iCs/>
-            <w:sz w:val="20"/>
-            <w:szCs w:val="20"/>
-          </w:rPr>
-          <w:t>v</w:t>
-        </w:r>
-        <w:r>
-          <w:rPr>
-            <w:rStyle w:val="Hyperlink"/>
-            <w:rFonts w:asciiTheme="minorHAnsi" w:hAnsiTheme="minorHAnsi" w:cstheme="minorHAnsi"/>
-            <w:i/>
-            <w:iCs/>
-            <w:sz w:val="20"/>
-            <w:szCs w:val="20"/>
-          </w:rPr>
-          <w:t>/?id=1763711615280720</w:t>
+          <w:t>https://workbin.dev/?id=1763711615280720</w:t>
         </w:r>
       </w:hyperlink>
     </w:p>
@@ -3284,6 +3229,7 @@
           <w:rFonts w:asciiTheme="minorHAnsi" w:hAnsiTheme="minorHAnsi" w:cstheme="minorHAnsi"/>
           <w:i/>
           <w:iCs/>
+          <w:noProof/>
           <w:color w:val="000000" w:themeColor="text1"/>
           <w:sz w:val="20"/>
           <w:szCs w:val="20"/>
@@ -3577,6 +3523,7 @@
           <w:rFonts w:asciiTheme="minorHAnsi" w:hAnsiTheme="minorHAnsi" w:cstheme="minorHAnsi"/>
           <w:i/>
           <w:iCs/>
+          <w:noProof/>
           <w:color w:val="000000" w:themeColor="text1"/>
           <w:sz w:val="20"/>
           <w:szCs w:val="20"/>
@@ -3727,6 +3674,7 @@
           <w:rFonts w:asciiTheme="minorHAnsi" w:hAnsiTheme="minorHAnsi" w:cstheme="minorHAnsi"/>
           <w:i/>
           <w:iCs/>
+          <w:noProof/>
           <w:color w:val="000000" w:themeColor="text1"/>
           <w:sz w:val="20"/>
           <w:szCs w:val="20"/>
@@ -3837,12 +3785,1090 @@
         <w:textAlignment w:val="baseline"/>
         <w:rPr>
           <w:rStyle w:val="normaltextrun"/>
-          <w:rFonts w:ascii="Calibri Light" w:hAnsi="Calibri Light" w:cs="Calibri Light"/>
-          <w:color w:val="2F5496"/>
-          <w:sz w:val="32"/>
-          <w:szCs w:val="32"/>
-        </w:rPr>
-      </w:pPr>
+          <w:rFonts w:asciiTheme="minorHAnsi" w:hAnsiTheme="minorHAnsi" w:cstheme="minorHAnsi"/>
+          <w:i/>
+          <w:iCs/>
+          <w:color w:val="000000" w:themeColor="text1"/>
+          <w:sz w:val="20"/>
+          <w:szCs w:val="20"/>
+        </w:rPr>
+      </w:pPr>
+      <w:r>
+        <w:rPr>
+          <w:rStyle w:val="normaltextrun"/>
+          <w:rFonts w:asciiTheme="minorHAnsi" w:hAnsiTheme="minorHAnsi" w:cstheme="minorHAnsi"/>
+          <w:i/>
+          <w:iCs/>
+          <w:color w:val="000000" w:themeColor="text1"/>
+          <w:sz w:val="20"/>
+          <w:szCs w:val="20"/>
+        </w:rPr>
+        <w:t xml:space="preserve">I uke 4 </w:t>
+      </w:r>
+      <w:r>
+        <w:rPr>
+          <w:rStyle w:val="normaltextrun"/>
+          <w:rFonts w:asciiTheme="minorHAnsi" w:hAnsiTheme="minorHAnsi" w:cstheme="minorHAnsi"/>
+          <w:i/>
+          <w:iCs/>
+          <w:color w:val="000000" w:themeColor="text1"/>
+          <w:sz w:val="20"/>
+          <w:szCs w:val="20"/>
+        </w:rPr>
+        <w:t xml:space="preserve">så startet jeg med </w:t>
+      </w:r>
+      <w:r>
+        <w:rPr>
+          <w:rStyle w:val="normaltextrun"/>
+          <w:rFonts w:asciiTheme="minorHAnsi" w:hAnsiTheme="minorHAnsi" w:cstheme="minorHAnsi"/>
+          <w:i/>
+          <w:iCs/>
+          <w:color w:val="000000" w:themeColor="text1"/>
+          <w:sz w:val="20"/>
+          <w:szCs w:val="20"/>
+        </w:rPr>
+        <w:t xml:space="preserve">å </w:t>
+      </w:r>
+      <w:r>
+        <w:rPr>
+          <w:rStyle w:val="normaltextrun"/>
+          <w:rFonts w:asciiTheme="minorHAnsi" w:hAnsiTheme="minorHAnsi" w:cstheme="minorHAnsi"/>
+          <w:i/>
+          <w:iCs/>
+          <w:color w:val="000000" w:themeColor="text1"/>
+          <w:sz w:val="20"/>
+          <w:szCs w:val="20"/>
+        </w:rPr>
+        <w:t>«refactore» litt av koden å fil strukturen (blant annet å flytte all navbar css-en i en egen fil, flytte all</w:t>
+      </w:r>
+      <w:r>
+        <w:rPr>
+          <w:rStyle w:val="normaltextrun"/>
+          <w:rFonts w:asciiTheme="minorHAnsi" w:hAnsiTheme="minorHAnsi" w:cstheme="minorHAnsi"/>
+          <w:i/>
+          <w:iCs/>
+          <w:color w:val="000000" w:themeColor="text1"/>
+          <w:sz w:val="20"/>
+          <w:szCs w:val="20"/>
+        </w:rPr>
+        <w:t xml:space="preserve"> navbar js-en i en egen fil, og endret litt på hvordan selve booking formen er satt opp.)</w:t>
+      </w:r>
+      <w:r>
+        <w:rPr>
+          <w:rStyle w:val="normaltextrun"/>
+          <w:rFonts w:asciiTheme="minorHAnsi" w:hAnsiTheme="minorHAnsi" w:cstheme="minorHAnsi"/>
+          <w:i/>
+          <w:iCs/>
+          <w:color w:val="000000" w:themeColor="text1"/>
+          <w:sz w:val="20"/>
+          <w:szCs w:val="20"/>
+        </w:rPr>
+        <w:t xml:space="preserve"> Etter det så </w:t>
+      </w:r>
+      <w:r>
+        <w:rPr>
+          <w:rStyle w:val="normaltextrun"/>
+          <w:rFonts w:asciiTheme="minorHAnsi" w:hAnsiTheme="minorHAnsi" w:cstheme="minorHAnsi"/>
+          <w:i/>
+          <w:iCs/>
+          <w:color w:val="000000" w:themeColor="text1"/>
+          <w:sz w:val="20"/>
+          <w:szCs w:val="20"/>
+        </w:rPr>
+        <w:t xml:space="preserve">gjorde jeg selve formen penere ved å gi de forskjellige input fields </w:t>
+      </w:r>
+      <w:r>
+        <w:rPr>
+          <w:rStyle w:val="normaltextrun"/>
+          <w:rFonts w:asciiTheme="minorHAnsi" w:hAnsiTheme="minorHAnsi" w:cstheme="minorHAnsi"/>
+          <w:i/>
+          <w:iCs/>
+          <w:color w:val="000000" w:themeColor="text1"/>
+          <w:sz w:val="20"/>
+          <w:szCs w:val="20"/>
+        </w:rPr>
+        <w:t xml:space="preserve">icons, hover effects, focus effects og </w:t>
+      </w:r>
+      <w:r>
+        <w:rPr>
+          <w:rStyle w:val="normaltextrun"/>
+          <w:rFonts w:asciiTheme="minorHAnsi" w:hAnsiTheme="minorHAnsi" w:cstheme="minorHAnsi"/>
+          <w:i/>
+          <w:iCs/>
+          <w:color w:val="000000" w:themeColor="text1"/>
+          <w:sz w:val="20"/>
+          <w:szCs w:val="20"/>
+        </w:rPr>
+        <w:lastRenderedPageBreak/>
+        <w:t>placeholder</w:t>
+      </w:r>
+      <w:r>
+        <w:rPr>
+          <w:rStyle w:val="normaltextrun"/>
+          <w:rFonts w:asciiTheme="minorHAnsi" w:hAnsiTheme="minorHAnsi" w:cstheme="minorHAnsi"/>
+          <w:i/>
+          <w:iCs/>
+          <w:color w:val="000000" w:themeColor="text1"/>
+          <w:sz w:val="20"/>
+          <w:szCs w:val="20"/>
+        </w:rPr>
+        <w:t xml:space="preserve"> text. (Det kan ha vært mer jeg ikke husker akkurat nå)</w:t>
+      </w:r>
+      <w:r>
+        <w:rPr>
+          <w:rStyle w:val="normaltextrun"/>
+          <w:rFonts w:asciiTheme="minorHAnsi" w:hAnsiTheme="minorHAnsi" w:cstheme="minorHAnsi"/>
+          <w:i/>
+          <w:iCs/>
+          <w:color w:val="000000" w:themeColor="text1"/>
+          <w:sz w:val="20"/>
+          <w:szCs w:val="20"/>
+        </w:rPr>
+        <w:br/>
+      </w:r>
+      <w:r>
+        <w:rPr>
+          <w:rStyle w:val="normaltextrun"/>
+          <w:rFonts w:asciiTheme="minorHAnsi" w:hAnsiTheme="minorHAnsi" w:cstheme="minorHAnsi"/>
+          <w:i/>
+          <w:iCs/>
+          <w:color w:val="000000" w:themeColor="text1"/>
+          <w:sz w:val="20"/>
+          <w:szCs w:val="20"/>
+        </w:rPr>
+        <w:drawing>
+          <wp:inline distT="0" distB="0" distL="0" distR="0" wp14:anchorId="7C714368" wp14:editId="3B52DC6E">
+            <wp:extent cx="5731510" cy="2230120"/>
+            <wp:effectExtent l="0" t="0" r="2540" b="0"/>
+            <wp:docPr id="1592295895" name="Picture 1" descr="A screenshot of a computer&#10;&#10;AI-generated content may be incorrect."/>
+            <wp:cNvGraphicFramePr>
+              <a:graphicFrameLocks xmlns:a="http://schemas.openxmlformats.org/drawingml/2006/main" noChangeAspect="1"/>
+            </wp:cNvGraphicFramePr>
+            <a:graphic xmlns:a="http://schemas.openxmlformats.org/drawingml/2006/main">
+              <a:graphicData uri="http://schemas.openxmlformats.org/drawingml/2006/picture">
+                <pic:pic xmlns:pic="http://schemas.openxmlformats.org/drawingml/2006/picture">
+                  <pic:nvPicPr>
+                    <pic:cNvPr id="1592295895" name="Picture 1" descr="A screenshot of a computer&#10;&#10;AI-generated content may be incorrect."/>
+                    <pic:cNvPicPr/>
+                  </pic:nvPicPr>
+                  <pic:blipFill>
+                    <a:blip r:embed="rId28"/>
+                    <a:stretch>
+                      <a:fillRect/>
+                    </a:stretch>
+                  </pic:blipFill>
+                  <pic:spPr>
+                    <a:xfrm>
+                      <a:off x="0" y="0"/>
+                      <a:ext cx="5731510" cy="2230120"/>
+                    </a:xfrm>
+                    <a:prstGeom prst="rect">
+                      <a:avLst/>
+                    </a:prstGeom>
+                  </pic:spPr>
+                </pic:pic>
+              </a:graphicData>
+            </a:graphic>
+          </wp:inline>
+        </w:drawing>
+      </w:r>
+      <w:r>
+        <w:rPr>
+          <w:rStyle w:val="normaltextrun"/>
+          <w:rFonts w:asciiTheme="minorHAnsi" w:hAnsiTheme="minorHAnsi" w:cstheme="minorHAnsi"/>
+          <w:i/>
+          <w:iCs/>
+          <w:color w:val="000000" w:themeColor="text1"/>
+          <w:sz w:val="20"/>
+          <w:szCs w:val="20"/>
+        </w:rPr>
+        <w:br/>
+      </w:r>
+    </w:p>
+    <w:p>
+      <w:pPr>
+        <w:pStyle w:val="paragraph"/>
+        <w:spacing w:before="0" w:beforeAutospacing="0" w:after="0" w:afterAutospacing="0"/>
+        <w:textAlignment w:val="baseline"/>
+        <w:rPr>
+          <w:rStyle w:val="normaltextrun"/>
+          <w:rFonts w:asciiTheme="minorHAnsi" w:hAnsiTheme="minorHAnsi" w:cstheme="minorHAnsi"/>
+          <w:i/>
+          <w:iCs/>
+          <w:color w:val="000000" w:themeColor="text1"/>
+          <w:sz w:val="20"/>
+          <w:szCs w:val="20"/>
+        </w:rPr>
+      </w:pPr>
+      <w:r>
+        <w:rPr>
+          <w:rStyle w:val="normaltextrun"/>
+          <w:rFonts w:asciiTheme="minorHAnsi" w:hAnsiTheme="minorHAnsi" w:cstheme="minorHAnsi"/>
+          <w:i/>
+          <w:iCs/>
+          <w:color w:val="000000" w:themeColor="text1"/>
+          <w:sz w:val="20"/>
+          <w:szCs w:val="20"/>
+        </w:rPr>
+        <w:t xml:space="preserve">Etter det jobbet jeg litt mer med responsive delen </w:t>
+      </w:r>
+      <w:r>
+        <w:rPr>
+          <w:rStyle w:val="normaltextrun"/>
+          <w:rFonts w:asciiTheme="minorHAnsi" w:hAnsiTheme="minorHAnsi" w:cstheme="minorHAnsi"/>
+          <w:i/>
+          <w:iCs/>
+          <w:color w:val="000000" w:themeColor="text1"/>
+          <w:sz w:val="20"/>
+          <w:szCs w:val="20"/>
+        </w:rPr>
+        <w:t xml:space="preserve">av siden via å putte alle elementene I en kolonne når bredden til skjermen er mindre en </w:t>
+      </w:r>
+      <w:r>
+        <w:rPr>
+          <w:rStyle w:val="normaltextrun"/>
+          <w:rFonts w:asciiTheme="minorHAnsi" w:hAnsiTheme="minorHAnsi" w:cstheme="minorHAnsi"/>
+          <w:i/>
+          <w:iCs/>
+          <w:color w:val="000000" w:themeColor="text1"/>
+          <w:sz w:val="20"/>
+          <w:szCs w:val="20"/>
+        </w:rPr>
+        <w:t>670px. Jeg fikset også noen små bugs som gikk ut over responsive-heten.</w:t>
+      </w:r>
+    </w:p>
+    <w:p>
+      <w:pPr>
+        <w:pStyle w:val="paragraph"/>
+        <w:spacing w:before="0" w:beforeAutospacing="0" w:after="0" w:afterAutospacing="0"/>
+        <w:textAlignment w:val="baseline"/>
+        <w:rPr>
+          <w:rStyle w:val="normaltextrun"/>
+          <w:rFonts w:asciiTheme="minorHAnsi" w:hAnsiTheme="minorHAnsi" w:cstheme="minorHAnsi"/>
+          <w:i/>
+          <w:iCs/>
+          <w:color w:val="000000" w:themeColor="text1"/>
+          <w:sz w:val="20"/>
+          <w:szCs w:val="20"/>
+        </w:rPr>
+      </w:pPr>
+      <w:r>
+        <w:rPr>
+          <w:rStyle w:val="normaltextrun"/>
+          <w:rFonts w:asciiTheme="minorHAnsi" w:hAnsiTheme="minorHAnsi" w:cstheme="minorHAnsi"/>
+          <w:i/>
+          <w:iCs/>
+          <w:color w:val="000000" w:themeColor="text1"/>
+          <w:sz w:val="20"/>
+          <w:szCs w:val="20"/>
+        </w:rPr>
+        <w:lastRenderedPageBreak/>
+        <w:br/>
+      </w:r>
+      <w:r>
+        <w:rPr>
+          <w:rStyle w:val="normaltextrun"/>
+          <w:rFonts w:asciiTheme="minorHAnsi" w:hAnsiTheme="minorHAnsi" w:cstheme="minorHAnsi"/>
+          <w:i/>
+          <w:iCs/>
+          <w:color w:val="000000" w:themeColor="text1"/>
+          <w:sz w:val="20"/>
+          <w:szCs w:val="20"/>
+        </w:rPr>
+        <w:drawing>
+          <wp:inline distT="0" distB="0" distL="0" distR="0" wp14:anchorId="022FADD9" wp14:editId="58998E93">
+            <wp:extent cx="5731510" cy="7475220"/>
+            <wp:effectExtent l="0" t="0" r="2540" b="0"/>
+            <wp:docPr id="1850191" name="Picture 1" descr="A screenshot of a phone&#10;&#10;AI-generated content may be incorrect."/>
+            <wp:cNvGraphicFramePr>
+              <a:graphicFrameLocks xmlns:a="http://schemas.openxmlformats.org/drawingml/2006/main" noChangeAspect="1"/>
+            </wp:cNvGraphicFramePr>
+            <a:graphic xmlns:a="http://schemas.openxmlformats.org/drawingml/2006/main">
+              <a:graphicData uri="http://schemas.openxmlformats.org/drawingml/2006/picture">
+                <pic:pic xmlns:pic="http://schemas.openxmlformats.org/drawingml/2006/picture">
+                  <pic:nvPicPr>
+                    <pic:cNvPr id="1850191" name="Picture 1" descr="A screenshot of a phone&#10;&#10;AI-generated content may be incorrect."/>
+                    <pic:cNvPicPr/>
+                  </pic:nvPicPr>
+                  <pic:blipFill>
+                    <a:blip r:embed="rId29"/>
+                    <a:stretch>
+                      <a:fillRect/>
+                    </a:stretch>
+                  </pic:blipFill>
+                  <pic:spPr>
+                    <a:xfrm>
+                      <a:off x="0" y="0"/>
+                      <a:ext cx="5731510" cy="7475220"/>
+                    </a:xfrm>
+                    <a:prstGeom prst="rect">
+                      <a:avLst/>
+                    </a:prstGeom>
+                  </pic:spPr>
+                </pic:pic>
+              </a:graphicData>
+            </a:graphic>
+          </wp:inline>
+        </w:drawing>
+      </w:r>
+      <w:r>
+        <w:rPr>
+          <w:rStyle w:val="normaltextrun"/>
+          <w:rFonts w:asciiTheme="minorHAnsi" w:hAnsiTheme="minorHAnsi" w:cstheme="minorHAnsi"/>
+          <w:i/>
+          <w:iCs/>
+          <w:color w:val="000000" w:themeColor="text1"/>
+          <w:sz w:val="20"/>
+          <w:szCs w:val="20"/>
+        </w:rPr>
+        <w:t xml:space="preserve"> </w:t>
+      </w:r>
+    </w:p>
+    <w:p>
+      <w:pPr>
+        <w:pStyle w:val="paragraph"/>
+        <w:spacing w:before="0" w:beforeAutospacing="0" w:after="0" w:afterAutospacing="0"/>
+        <w:textAlignment w:val="baseline"/>
+        <w:rPr>
+          <w:rStyle w:val="normaltextrun"/>
+          <w:rFonts w:asciiTheme="minorHAnsi" w:hAnsiTheme="minorHAnsi" w:cstheme="minorHAnsi"/>
+          <w:i/>
+          <w:iCs/>
+          <w:color w:val="000000" w:themeColor="text1"/>
+          <w:sz w:val="20"/>
+          <w:szCs w:val="20"/>
+        </w:rPr>
+      </w:pPr>
+      <w:r>
+        <w:rPr>
+          <w:rStyle w:val="normaltextrun"/>
+          <w:rFonts w:asciiTheme="minorHAnsi" w:hAnsiTheme="minorHAnsi" w:cstheme="minorHAnsi"/>
+          <w:i/>
+          <w:iCs/>
+          <w:color w:val="000000" w:themeColor="text1"/>
+          <w:sz w:val="20"/>
+          <w:szCs w:val="20"/>
+        </w:rPr>
+        <w:lastRenderedPageBreak/>
+        <w:drawing>
+          <wp:inline distT="0" distB="0" distL="0" distR="0" wp14:anchorId="57A43C9E" wp14:editId="3AC618C0">
+            <wp:extent cx="4410691" cy="6773220"/>
+            <wp:effectExtent l="0" t="0" r="9525" b="0"/>
+            <wp:docPr id="1434552846" name="Picture 1" descr="A screen shot of a computer program&#10;&#10;AI-generated content may be incorrect."/>
+            <wp:cNvGraphicFramePr>
+              <a:graphicFrameLocks xmlns:a="http://schemas.openxmlformats.org/drawingml/2006/main" noChangeAspect="1"/>
+            </wp:cNvGraphicFramePr>
+            <a:graphic xmlns:a="http://schemas.openxmlformats.org/drawingml/2006/main">
+              <a:graphicData uri="http://schemas.openxmlformats.org/drawingml/2006/picture">
+                <pic:pic xmlns:pic="http://schemas.openxmlformats.org/drawingml/2006/picture">
+                  <pic:nvPicPr>
+                    <pic:cNvPr id="1434552846" name="Picture 1" descr="A screen shot of a computer program&#10;&#10;AI-generated content may be incorrect."/>
+                    <pic:cNvPicPr/>
+                  </pic:nvPicPr>
+                  <pic:blipFill>
+                    <a:blip r:embed="rId30"/>
+                    <a:stretch>
+                      <a:fillRect/>
+                    </a:stretch>
+                  </pic:blipFill>
+                  <pic:spPr>
+                    <a:xfrm>
+                      <a:off x="0" y="0"/>
+                      <a:ext cx="4410691" cy="6773220"/>
+                    </a:xfrm>
+                    <a:prstGeom prst="rect">
+                      <a:avLst/>
+                    </a:prstGeom>
+                  </pic:spPr>
+                </pic:pic>
+              </a:graphicData>
+            </a:graphic>
+          </wp:inline>
+        </w:drawing>
+      </w:r>
+    </w:p>
+    <w:p>
+      <w:pPr>
+        <w:pStyle w:val="paragraph"/>
+        <w:spacing w:before="0" w:beforeAutospacing="0" w:after="0" w:afterAutospacing="0"/>
+        <w:textAlignment w:val="baseline"/>
+        <w:rPr>
+          <w:rStyle w:val="normaltextrun"/>
+          <w:rFonts w:asciiTheme="minorHAnsi" w:hAnsiTheme="minorHAnsi" w:cstheme="minorHAnsi"/>
+          <w:i/>
+          <w:iCs/>
+          <w:color w:val="000000" w:themeColor="text1"/>
+          <w:sz w:val="20"/>
+          <w:szCs w:val="20"/>
+        </w:rPr>
+      </w:pPr>
+    </w:p>
+    <w:p>
+      <w:pPr>
+        <w:pStyle w:val="paragraph"/>
+        <w:spacing w:before="0" w:beforeAutospacing="0" w:after="0" w:afterAutospacing="0"/>
+        <w:textAlignment w:val="baseline"/>
+        <w:rPr>
+          <w:rStyle w:val="normaltextrun"/>
+          <w:rFonts w:asciiTheme="minorHAnsi" w:hAnsiTheme="minorHAnsi" w:cstheme="minorHAnsi"/>
+          <w:i/>
+          <w:iCs/>
+          <w:color w:val="000000" w:themeColor="text1"/>
+          <w:sz w:val="20"/>
+          <w:szCs w:val="20"/>
+        </w:rPr>
+      </w:pPr>
+      <w:r>
+        <w:rPr>
+          <w:rStyle w:val="normaltextrun"/>
+          <w:rFonts w:asciiTheme="minorHAnsi" w:hAnsiTheme="minorHAnsi" w:cstheme="minorHAnsi"/>
+          <w:i/>
+          <w:iCs/>
+          <w:color w:val="000000" w:themeColor="text1"/>
+          <w:sz w:val="20"/>
+          <w:szCs w:val="20"/>
+        </w:rPr>
+        <w:t>Jeg føler meg litt mer fornøyd med nettsiden nå</w:t>
+      </w:r>
+      <w:r>
+        <w:rPr>
+          <w:rStyle w:val="normaltextrun"/>
+          <w:rFonts w:asciiTheme="minorHAnsi" w:hAnsiTheme="minorHAnsi" w:cstheme="minorHAnsi"/>
+          <w:i/>
+          <w:iCs/>
+          <w:color w:val="000000" w:themeColor="text1"/>
+          <w:sz w:val="20"/>
+          <w:szCs w:val="20"/>
+        </w:rPr>
+        <w:t xml:space="preserve">, men radio knappen (altså de hvor du velger pass-type) mangler litt kjærlighet. Dessverre har jeg ikke nokk tid til å fikse det å må begynne på </w:t>
+      </w:r>
+      <w:r>
+        <w:rPr>
+          <w:rStyle w:val="normaltextrun"/>
+          <w:rFonts w:asciiTheme="minorHAnsi" w:hAnsiTheme="minorHAnsi" w:cstheme="minorHAnsi"/>
+          <w:i/>
+          <w:iCs/>
+          <w:color w:val="000000" w:themeColor="text1"/>
+          <w:sz w:val="20"/>
+          <w:szCs w:val="20"/>
+        </w:rPr>
+        <w:t xml:space="preserve">JSON data lagringen </w:t>
+      </w:r>
+      <w:r>
+        <w:rPr>
+          <w:rStyle w:val="normaltextrun"/>
+          <w:rFonts w:asciiTheme="minorHAnsi" w:hAnsiTheme="minorHAnsi" w:cstheme="minorHAnsi"/>
+          <w:i/>
+          <w:iCs/>
+          <w:color w:val="000000" w:themeColor="text1"/>
+          <w:sz w:val="20"/>
+          <w:szCs w:val="20"/>
+        </w:rPr>
+        <w:t>og takk</w:t>
+      </w:r>
+      <w:r>
+        <w:rPr>
+          <w:rStyle w:val="normaltextrun"/>
+          <w:rFonts w:asciiTheme="minorHAnsi" w:hAnsiTheme="minorHAnsi" w:cstheme="minorHAnsi"/>
+          <w:i/>
+          <w:iCs/>
+          <w:color w:val="000000" w:themeColor="text1"/>
+          <w:sz w:val="20"/>
+          <w:szCs w:val="20"/>
+        </w:rPr>
+        <w:t xml:space="preserve"> siden.</w:t>
+      </w:r>
+    </w:p>
+    <w:p>
+      <w:pPr>
+        <w:pStyle w:val="paragraph"/>
+        <w:spacing w:before="0" w:beforeAutospacing="0" w:after="0" w:afterAutospacing="0"/>
+        <w:textAlignment w:val="baseline"/>
+        <w:rPr>
+          <w:rStyle w:val="normaltextrun"/>
+          <w:rFonts w:asciiTheme="minorHAnsi" w:hAnsiTheme="minorHAnsi" w:cstheme="minorHAnsi"/>
+          <w:i/>
+          <w:iCs/>
+          <w:color w:val="000000" w:themeColor="text1"/>
+          <w:sz w:val="20"/>
+          <w:szCs w:val="20"/>
+        </w:rPr>
+      </w:pPr>
+    </w:p>
+    <w:p>
+      <w:pPr>
+        <w:pStyle w:val="paragraph"/>
+        <w:spacing w:before="0" w:beforeAutospacing="0" w:after="0" w:afterAutospacing="0"/>
+        <w:textAlignment w:val="baseline"/>
+        <w:rPr>
+          <w:rStyle w:val="normaltextrun"/>
+          <w:rFonts w:asciiTheme="minorHAnsi" w:hAnsiTheme="minorHAnsi" w:cstheme="minorHAnsi"/>
+          <w:i/>
+          <w:iCs/>
+          <w:color w:val="000000" w:themeColor="text1"/>
+          <w:sz w:val="20"/>
+          <w:szCs w:val="20"/>
+        </w:rPr>
+      </w:pPr>
+      <w:r>
+        <w:rPr>
+          <w:rStyle w:val="normaltextrun"/>
+          <w:rFonts w:asciiTheme="minorHAnsi" w:hAnsiTheme="minorHAnsi" w:cstheme="minorHAnsi"/>
+          <w:i/>
+          <w:iCs/>
+          <w:color w:val="000000" w:themeColor="text1"/>
+          <w:sz w:val="20"/>
+          <w:szCs w:val="20"/>
+        </w:rPr>
+        <w:t>Jeg begynte selv med å kode, å jeg fikk den til å skrive ut det jeg hadde skrevet inni formen til å bli printe</w:t>
+      </w:r>
+      <w:r>
+        <w:rPr>
+          <w:rStyle w:val="normaltextrun"/>
+          <w:rFonts w:asciiTheme="minorHAnsi" w:hAnsiTheme="minorHAnsi" w:cstheme="minorHAnsi"/>
+          <w:i/>
+          <w:iCs/>
+          <w:color w:val="000000" w:themeColor="text1"/>
+          <w:sz w:val="20"/>
+          <w:szCs w:val="20"/>
+        </w:rPr>
+        <w:t>t</w:t>
+      </w:r>
+      <w:r>
+        <w:rPr>
+          <w:rStyle w:val="normaltextrun"/>
+          <w:rFonts w:asciiTheme="minorHAnsi" w:hAnsiTheme="minorHAnsi" w:cstheme="minorHAnsi"/>
+          <w:i/>
+          <w:iCs/>
+          <w:color w:val="000000" w:themeColor="text1"/>
+          <w:sz w:val="20"/>
+          <w:szCs w:val="20"/>
+        </w:rPr>
+        <w:t xml:space="preserve"> ut i </w:t>
+      </w:r>
+      <w:r>
+        <w:rPr>
+          <w:rStyle w:val="normaltextrun"/>
+          <w:rFonts w:asciiTheme="minorHAnsi" w:hAnsiTheme="minorHAnsi" w:cstheme="minorHAnsi"/>
+          <w:i/>
+          <w:iCs/>
+          <w:color w:val="000000" w:themeColor="text1"/>
+          <w:sz w:val="20"/>
+          <w:szCs w:val="20"/>
+        </w:rPr>
+        <w:t>konsollen</w:t>
+      </w:r>
+      <w:r>
+        <w:rPr>
+          <w:rStyle w:val="normaltextrun"/>
+          <w:rFonts w:asciiTheme="minorHAnsi" w:hAnsiTheme="minorHAnsi" w:cstheme="minorHAnsi"/>
+          <w:i/>
+          <w:iCs/>
+          <w:color w:val="000000" w:themeColor="text1"/>
+          <w:sz w:val="20"/>
+          <w:szCs w:val="20"/>
+        </w:rPr>
+        <w:t xml:space="preserve">, men trengte litt hjelp </w:t>
+      </w:r>
+      <w:r>
+        <w:rPr>
+          <w:rStyle w:val="normaltextrun"/>
+          <w:rFonts w:asciiTheme="minorHAnsi" w:hAnsiTheme="minorHAnsi" w:cstheme="minorHAnsi"/>
+          <w:i/>
+          <w:iCs/>
+          <w:color w:val="000000" w:themeColor="text1"/>
+          <w:sz w:val="20"/>
+          <w:szCs w:val="20"/>
+        </w:rPr>
+        <w:t xml:space="preserve">fra den innebygde AI botten til å fikse selve lagringen av dataen fordi det innebærer </w:t>
+      </w:r>
+      <w:r>
+        <w:rPr>
+          <w:rStyle w:val="normaltextrun"/>
+          <w:rFonts w:asciiTheme="minorHAnsi" w:hAnsiTheme="minorHAnsi" w:cstheme="minorHAnsi"/>
+          <w:i/>
+          <w:iCs/>
+          <w:color w:val="000000" w:themeColor="text1"/>
+          <w:sz w:val="20"/>
+          <w:szCs w:val="20"/>
+        </w:rPr>
+        <w:t>og sette opp</w:t>
+      </w:r>
+      <w:r>
+        <w:rPr>
+          <w:rStyle w:val="normaltextrun"/>
+          <w:rFonts w:asciiTheme="minorHAnsi" w:hAnsiTheme="minorHAnsi" w:cstheme="minorHAnsi"/>
+          <w:i/>
+          <w:iCs/>
+          <w:color w:val="000000" w:themeColor="text1"/>
+          <w:sz w:val="20"/>
+          <w:szCs w:val="20"/>
+        </w:rPr>
+        <w:t xml:space="preserve"> en</w:t>
+      </w:r>
+      <w:r>
+        <w:rPr>
+          <w:rStyle w:val="normaltextrun"/>
+          <w:rFonts w:asciiTheme="minorHAnsi" w:hAnsiTheme="minorHAnsi" w:cstheme="minorHAnsi"/>
+          <w:i/>
+          <w:iCs/>
+          <w:color w:val="000000" w:themeColor="text1"/>
+          <w:sz w:val="20"/>
+          <w:szCs w:val="20"/>
+        </w:rPr>
+        <w:t xml:space="preserve"> </w:t>
+      </w:r>
+      <w:r>
+        <w:rPr>
+          <w:rStyle w:val="normaltextrun"/>
+          <w:rFonts w:asciiTheme="minorHAnsi" w:hAnsiTheme="minorHAnsi" w:cstheme="minorHAnsi"/>
+          <w:i/>
+          <w:iCs/>
+          <w:color w:val="000000" w:themeColor="text1"/>
+          <w:sz w:val="20"/>
+          <w:szCs w:val="20"/>
+        </w:rPr>
+        <w:t xml:space="preserve">«post» del </w:t>
+      </w:r>
+      <w:r>
+        <w:rPr>
+          <w:rStyle w:val="normaltextrun"/>
+          <w:rFonts w:asciiTheme="minorHAnsi" w:hAnsiTheme="minorHAnsi" w:cstheme="minorHAnsi"/>
+          <w:i/>
+          <w:iCs/>
+          <w:color w:val="000000" w:themeColor="text1"/>
+          <w:sz w:val="20"/>
+          <w:szCs w:val="20"/>
+        </w:rPr>
+        <w:t>til</w:t>
+      </w:r>
+      <w:r>
+        <w:rPr>
+          <w:rStyle w:val="normaltextrun"/>
+          <w:rFonts w:asciiTheme="minorHAnsi" w:hAnsiTheme="minorHAnsi" w:cstheme="minorHAnsi"/>
+          <w:i/>
+          <w:iCs/>
+          <w:color w:val="000000" w:themeColor="text1"/>
+          <w:sz w:val="20"/>
+          <w:szCs w:val="20"/>
+        </w:rPr>
+        <w:t xml:space="preserve"> node.js serveren og det ble litt mye på den korte tiden jeg hadde igjen</w:t>
+      </w:r>
+    </w:p>
+    <w:p>
+      <w:pPr>
+        <w:pStyle w:val="paragraph"/>
+        <w:spacing w:before="0" w:beforeAutospacing="0" w:after="0" w:afterAutospacing="0"/>
+        <w:textAlignment w:val="baseline"/>
+        <w:rPr>
+          <w:rStyle w:val="normaltextrun"/>
+          <w:rFonts w:asciiTheme="minorHAnsi" w:hAnsiTheme="minorHAnsi" w:cstheme="minorHAnsi"/>
+          <w:i/>
+          <w:iCs/>
+          <w:color w:val="000000" w:themeColor="text1"/>
+          <w:sz w:val="20"/>
+          <w:szCs w:val="20"/>
+        </w:rPr>
+      </w:pPr>
+    </w:p>
+    <w:p>
+      <w:pPr>
+        <w:pStyle w:val="paragraph"/>
+        <w:spacing w:before="0" w:beforeAutospacing="0" w:after="0" w:afterAutospacing="0"/>
+        <w:textAlignment w:val="baseline"/>
+        <w:rPr>
+          <w:rStyle w:val="normaltextrun"/>
+          <w:rFonts w:asciiTheme="minorHAnsi" w:hAnsiTheme="minorHAnsi" w:cstheme="minorHAnsi"/>
+          <w:i/>
+          <w:iCs/>
+          <w:color w:val="000000" w:themeColor="text1"/>
+          <w:sz w:val="20"/>
+          <w:szCs w:val="20"/>
+        </w:rPr>
+      </w:pPr>
+      <w:r>
+        <w:rPr>
+          <w:rStyle w:val="normaltextrun"/>
+          <w:rFonts w:asciiTheme="minorHAnsi" w:hAnsiTheme="minorHAnsi" w:cstheme="minorHAnsi"/>
+          <w:i/>
+          <w:iCs/>
+          <w:color w:val="000000" w:themeColor="text1"/>
+          <w:sz w:val="20"/>
+          <w:szCs w:val="20"/>
+        </w:rPr>
+        <w:lastRenderedPageBreak/>
+        <w:drawing>
+          <wp:inline distT="0" distB="0" distL="0" distR="0" wp14:anchorId="6A04C26F" wp14:editId="3AA3FE6D">
+            <wp:extent cx="5731510" cy="8037830"/>
+            <wp:effectExtent l="0" t="0" r="2540" b="1270"/>
+            <wp:docPr id="1480282805" name="Picture 1" descr="A screen shot of a computer program&#10;&#10;AI-generated content may be incorrect."/>
+            <wp:cNvGraphicFramePr>
+              <a:graphicFrameLocks xmlns:a="http://schemas.openxmlformats.org/drawingml/2006/main" noChangeAspect="1"/>
+            </wp:cNvGraphicFramePr>
+            <a:graphic xmlns:a="http://schemas.openxmlformats.org/drawingml/2006/main">
+              <a:graphicData uri="http://schemas.openxmlformats.org/drawingml/2006/picture">
+                <pic:pic xmlns:pic="http://schemas.openxmlformats.org/drawingml/2006/picture">
+                  <pic:nvPicPr>
+                    <pic:cNvPr id="1480282805" name="Picture 1" descr="A screen shot of a computer program&#10;&#10;AI-generated content may be incorrect."/>
+                    <pic:cNvPicPr/>
+                  </pic:nvPicPr>
+                  <pic:blipFill>
+                    <a:blip r:embed="rId31"/>
+                    <a:stretch>
+                      <a:fillRect/>
+                    </a:stretch>
+                  </pic:blipFill>
+                  <pic:spPr>
+                    <a:xfrm>
+                      <a:off x="0" y="0"/>
+                      <a:ext cx="5731510" cy="8037830"/>
+                    </a:xfrm>
+                    <a:prstGeom prst="rect">
+                      <a:avLst/>
+                    </a:prstGeom>
+                  </pic:spPr>
+                </pic:pic>
+              </a:graphicData>
+            </a:graphic>
+          </wp:inline>
+        </w:drawing>
+      </w:r>
+    </w:p>
+    <w:p>
+      <w:pPr>
+        <w:pStyle w:val="paragraph"/>
+        <w:spacing w:before="0" w:beforeAutospacing="0" w:after="0" w:afterAutospacing="0"/>
+        <w:textAlignment w:val="baseline"/>
+        <w:rPr>
+          <w:rStyle w:val="normaltextrun"/>
+          <w:rFonts w:asciiTheme="minorHAnsi" w:hAnsiTheme="minorHAnsi" w:cstheme="minorHAnsi"/>
+          <w:i/>
+          <w:iCs/>
+          <w:color w:val="000000" w:themeColor="text1"/>
+          <w:sz w:val="20"/>
+          <w:szCs w:val="20"/>
+        </w:rPr>
+      </w:pPr>
+      <w:r>
+        <w:rPr>
+          <w:rStyle w:val="normaltextrun"/>
+          <w:rFonts w:asciiTheme="minorHAnsi" w:hAnsiTheme="minorHAnsi" w:cstheme="minorHAnsi"/>
+          <w:i/>
+          <w:iCs/>
+          <w:color w:val="000000" w:themeColor="text1"/>
+          <w:sz w:val="20"/>
+          <w:szCs w:val="20"/>
+        </w:rPr>
+        <w:lastRenderedPageBreak/>
+        <w:drawing>
+          <wp:inline distT="0" distB="0" distL="0" distR="0" wp14:anchorId="0A313FDD" wp14:editId="36001586">
+            <wp:extent cx="5731510" cy="3956050"/>
+            <wp:effectExtent l="0" t="0" r="2540" b="6350"/>
+            <wp:docPr id="368598544" name="Picture 1" descr="A screen shot of a computer program&#10;&#10;AI-generated content may be incorrect."/>
+            <wp:cNvGraphicFramePr>
+              <a:graphicFrameLocks xmlns:a="http://schemas.openxmlformats.org/drawingml/2006/main" noChangeAspect="1"/>
+            </wp:cNvGraphicFramePr>
+            <a:graphic xmlns:a="http://schemas.openxmlformats.org/drawingml/2006/main">
+              <a:graphicData uri="http://schemas.openxmlformats.org/drawingml/2006/picture">
+                <pic:pic xmlns:pic="http://schemas.openxmlformats.org/drawingml/2006/picture">
+                  <pic:nvPicPr>
+                    <pic:cNvPr id="368598544" name="Picture 1" descr="A screen shot of a computer program&#10;&#10;AI-generated content may be incorrect."/>
+                    <pic:cNvPicPr/>
+                  </pic:nvPicPr>
+                  <pic:blipFill>
+                    <a:blip r:embed="rId32"/>
+                    <a:stretch>
+                      <a:fillRect/>
+                    </a:stretch>
+                  </pic:blipFill>
+                  <pic:spPr>
+                    <a:xfrm>
+                      <a:off x="0" y="0"/>
+                      <a:ext cx="5731510" cy="3956050"/>
+                    </a:xfrm>
+                    <a:prstGeom prst="rect">
+                      <a:avLst/>
+                    </a:prstGeom>
+                  </pic:spPr>
+                </pic:pic>
+              </a:graphicData>
+            </a:graphic>
+          </wp:inline>
+        </w:drawing>
+      </w:r>
+    </w:p>
+    <w:p>
+      <w:pPr>
+        <w:pStyle w:val="paragraph"/>
+        <w:spacing w:before="0" w:beforeAutospacing="0" w:after="0" w:afterAutospacing="0"/>
+        <w:textAlignment w:val="baseline"/>
+        <w:rPr>
+          <w:rStyle w:val="normaltextrun"/>
+          <w:rFonts w:asciiTheme="minorHAnsi" w:hAnsiTheme="minorHAnsi" w:cstheme="minorHAnsi"/>
+          <w:i/>
+          <w:iCs/>
+          <w:color w:val="000000" w:themeColor="text1"/>
+          <w:sz w:val="20"/>
+          <w:szCs w:val="20"/>
+        </w:rPr>
+      </w:pPr>
+    </w:p>
+    <w:p>
+      <w:pPr>
+        <w:pStyle w:val="paragraph"/>
+        <w:spacing w:before="0" w:beforeAutospacing="0" w:after="0" w:afterAutospacing="0"/>
+        <w:textAlignment w:val="baseline"/>
+        <w:rPr>
+          <w:rStyle w:val="normaltextrun"/>
+          <w:rFonts w:asciiTheme="minorHAnsi" w:hAnsiTheme="minorHAnsi" w:cstheme="minorHAnsi"/>
+          <w:i/>
+          <w:iCs/>
+          <w:color w:val="000000" w:themeColor="text1"/>
+          <w:sz w:val="20"/>
+          <w:szCs w:val="20"/>
+        </w:rPr>
+      </w:pPr>
+      <w:r>
+        <w:rPr>
+          <w:rStyle w:val="normaltextrun"/>
+          <w:rFonts w:asciiTheme="minorHAnsi" w:hAnsiTheme="minorHAnsi" w:cstheme="minorHAnsi"/>
+          <w:i/>
+          <w:iCs/>
+          <w:color w:val="000000" w:themeColor="text1"/>
+          <w:sz w:val="20"/>
+          <w:szCs w:val="20"/>
+        </w:rPr>
+        <w:t xml:space="preserve">Jeg fikset også at </w:t>
+      </w:r>
+      <w:r>
+        <w:rPr>
+          <w:rStyle w:val="normaltextrun"/>
+          <w:rFonts w:asciiTheme="minorHAnsi" w:hAnsiTheme="minorHAnsi" w:cstheme="minorHAnsi"/>
+          <w:i/>
+          <w:iCs/>
+          <w:color w:val="000000" w:themeColor="text1"/>
+          <w:sz w:val="20"/>
+          <w:szCs w:val="20"/>
+        </w:rPr>
+        <w:t xml:space="preserve">den sender deg til takk.html delen av nettsiden når du submitter forumen, men bare hvis </w:t>
+      </w:r>
+      <w:r>
+        <w:rPr>
+          <w:rStyle w:val="normaltextrun"/>
+          <w:rFonts w:asciiTheme="minorHAnsi" w:hAnsiTheme="minorHAnsi" w:cstheme="minorHAnsi"/>
+          <w:i/>
+          <w:iCs/>
+          <w:color w:val="000000" w:themeColor="text1"/>
+          <w:sz w:val="20"/>
+          <w:szCs w:val="20"/>
+        </w:rPr>
+        <w:t>du faktisk submittet forumen så du kan ikke skrive URL-en til takk siden for å komme deg dit.</w:t>
+      </w:r>
+    </w:p>
+    <w:p>
+      <w:pPr>
+        <w:rPr>
+          <w:rStyle w:val="normaltextrun"/>
+          <w:rFonts w:eastAsia="Times New Roman" w:cstheme="minorHAnsi"/>
+          <w:i/>
+          <w:iCs/>
+          <w:color w:val="000000" w:themeColor="text1"/>
+          <w:lang w:eastAsia="nb-NO"/>
+        </w:rPr>
+      </w:pPr>
+      <w:r>
+        <w:rPr>
+          <w:rStyle w:val="normaltextrun"/>
+          <w:rFonts w:eastAsia="Times New Roman" w:cstheme="minorHAnsi"/>
+          <w:i/>
+          <w:iCs/>
+          <w:color w:val="000000" w:themeColor="text1"/>
+          <w:lang w:eastAsia="nb-NO"/>
+        </w:rPr>
+        <w:drawing>
+          <wp:inline distT="0" distB="0" distL="0" distR="0" wp14:anchorId="71311B16" wp14:editId="7A76D063">
+            <wp:extent cx="5731510" cy="1149350"/>
+            <wp:effectExtent l="0" t="0" r="2540" b="0"/>
+            <wp:docPr id="642943960" name="Picture 1" descr="A screenshot of a computer code&#10;&#10;AI-generated content may be incorrect."/>
+            <wp:cNvGraphicFramePr>
+              <a:graphicFrameLocks xmlns:a="http://schemas.openxmlformats.org/drawingml/2006/main" noChangeAspect="1"/>
+            </wp:cNvGraphicFramePr>
+            <a:graphic xmlns:a="http://schemas.openxmlformats.org/drawingml/2006/main">
+              <a:graphicData uri="http://schemas.openxmlformats.org/drawingml/2006/picture">
+                <pic:pic xmlns:pic="http://schemas.openxmlformats.org/drawingml/2006/picture">
+                  <pic:nvPicPr>
+                    <pic:cNvPr id="642943960" name="Picture 1" descr="A screenshot of a computer code&#10;&#10;AI-generated content may be incorrect."/>
+                    <pic:cNvPicPr/>
+                  </pic:nvPicPr>
+                  <pic:blipFill>
+                    <a:blip r:embed="rId33"/>
+                    <a:stretch>
+                      <a:fillRect/>
+                    </a:stretch>
+                  </pic:blipFill>
+                  <pic:spPr>
+                    <a:xfrm>
+                      <a:off x="0" y="0"/>
+                      <a:ext cx="5731510" cy="1149350"/>
+                    </a:xfrm>
+                    <a:prstGeom prst="rect">
+                      <a:avLst/>
+                    </a:prstGeom>
+                  </pic:spPr>
+                </pic:pic>
+              </a:graphicData>
+            </a:graphic>
+          </wp:inline>
+        </w:drawing>
+      </w:r>
+    </w:p>
+    <w:p>
+      <w:pPr>
+        <w:rPr>
+          <w:rStyle w:val="normaltextrun"/>
+          <w:rFonts w:eastAsia="Times New Roman" w:cstheme="minorHAnsi"/>
+          <w:i/>
+          <w:iCs/>
+          <w:color w:val="000000" w:themeColor="text1"/>
+          <w:lang w:eastAsia="nb-NO"/>
+        </w:rPr>
+      </w:pPr>
+      <w:r>
+        <w:rPr>
+          <w:rStyle w:val="normaltextrun"/>
+          <w:rFonts w:eastAsia="Times New Roman" w:cstheme="minorHAnsi"/>
+          <w:i/>
+          <w:iCs/>
+          <w:color w:val="000000" w:themeColor="text1"/>
+          <w:lang w:eastAsia="nb-NO"/>
+        </w:rPr>
+        <w:t xml:space="preserve">Jeg </w:t>
+      </w:r>
+      <w:r>
+        <w:rPr>
+          <w:rStyle w:val="normaltextrun"/>
+          <w:rFonts w:eastAsia="Times New Roman" w:cstheme="minorHAnsi"/>
+          <w:i/>
+          <w:iCs/>
+          <w:color w:val="000000" w:themeColor="text1"/>
+          <w:lang w:eastAsia="nb-NO"/>
+        </w:rPr>
+        <w:t xml:space="preserve">fikk også laget </w:t>
+      </w:r>
+      <w:r>
+        <w:rPr>
+          <w:rStyle w:val="normaltextrun"/>
+          <w:rFonts w:eastAsia="Times New Roman" w:cstheme="minorHAnsi"/>
+          <w:i/>
+          <w:iCs/>
+          <w:color w:val="000000" w:themeColor="text1"/>
+          <w:lang w:eastAsia="nb-NO"/>
+        </w:rPr>
+        <w:t xml:space="preserve">selve takk siden sin HTML / CSS kode å nå ser den sånn ut: </w:t>
+      </w:r>
+    </w:p>
+    <w:p>
+      <w:pPr>
+        <w:rPr>
+          <w:rStyle w:val="normaltextrun"/>
+          <w:rFonts w:eastAsia="Times New Roman" w:cstheme="minorHAnsi"/>
+          <w:i/>
+          <w:iCs/>
+          <w:color w:val="000000" w:themeColor="text1"/>
+          <w:lang w:eastAsia="nb-NO"/>
+        </w:rPr>
+      </w:pPr>
+      <w:r>
+        <w:rPr>
+          <w:rStyle w:val="normaltextrun"/>
+          <w:rFonts w:eastAsia="Times New Roman" w:cstheme="minorHAnsi"/>
+          <w:i/>
+          <w:iCs/>
+          <w:color w:val="000000" w:themeColor="text1"/>
+          <w:lang w:eastAsia="nb-NO"/>
+        </w:rPr>
+        <w:lastRenderedPageBreak/>
+        <w:drawing>
+          <wp:inline distT="0" distB="0" distL="0" distR="0" wp14:anchorId="47C7F585" wp14:editId="72154F95">
+            <wp:extent cx="5731510" cy="3076575"/>
+            <wp:effectExtent l="0" t="0" r="2540" b="9525"/>
+            <wp:docPr id="833589551" name="Picture 1" descr="A screenshot of a computer&#10;&#10;AI-generated content may be incorrect."/>
+            <wp:cNvGraphicFramePr>
+              <a:graphicFrameLocks xmlns:a="http://schemas.openxmlformats.org/drawingml/2006/main" noChangeAspect="1"/>
+            </wp:cNvGraphicFramePr>
+            <a:graphic xmlns:a="http://schemas.openxmlformats.org/drawingml/2006/main">
+              <a:graphicData uri="http://schemas.openxmlformats.org/drawingml/2006/picture">
+                <pic:pic xmlns:pic="http://schemas.openxmlformats.org/drawingml/2006/picture">
+                  <pic:nvPicPr>
+                    <pic:cNvPr id="833589551" name="Picture 1" descr="A screenshot of a computer&#10;&#10;AI-generated content may be incorrect."/>
+                    <pic:cNvPicPr/>
+                  </pic:nvPicPr>
+                  <pic:blipFill>
+                    <a:blip r:embed="rId34"/>
+                    <a:stretch>
+                      <a:fillRect/>
+                    </a:stretch>
+                  </pic:blipFill>
+                  <pic:spPr>
+                    <a:xfrm>
+                      <a:off x="0" y="0"/>
+                      <a:ext cx="5731510" cy="3076575"/>
+                    </a:xfrm>
+                    <a:prstGeom prst="rect">
+                      <a:avLst/>
+                    </a:prstGeom>
+                  </pic:spPr>
+                </pic:pic>
+              </a:graphicData>
+            </a:graphic>
+          </wp:inline>
+        </w:drawing>
+      </w:r>
+    </w:p>
+    <w:p>
+      <w:pPr>
+        <w:rPr>
+          <w:rStyle w:val="normaltextrun"/>
+          <w:rFonts w:eastAsia="Times New Roman" w:cstheme="minorHAnsi"/>
+          <w:i/>
+          <w:iCs/>
+          <w:color w:val="000000" w:themeColor="text1"/>
+          <w:lang w:eastAsia="nb-NO"/>
+        </w:rPr>
+      </w:pPr>
+      <w:r>
+        <w:rPr>
+          <w:rStyle w:val="normaltextrun"/>
+          <w:rFonts w:eastAsia="Times New Roman" w:cstheme="minorHAnsi"/>
+          <w:i/>
+          <w:iCs/>
+          <w:color w:val="000000" w:themeColor="text1"/>
+          <w:lang w:eastAsia="nb-NO"/>
+        </w:rPr>
+        <w:t>Her tar den da informasjonen</w:t>
+      </w:r>
+      <w:r>
+        <w:rPr>
+          <w:rStyle w:val="normaltextrun"/>
+          <w:rFonts w:eastAsia="Times New Roman" w:cstheme="minorHAnsi"/>
+          <w:i/>
+          <w:iCs/>
+          <w:color w:val="000000" w:themeColor="text1"/>
+          <w:lang w:eastAsia="nb-NO"/>
+        </w:rPr>
+        <w:t xml:space="preserve"> fra formen som du fylte når du bestilte pass og bytter teksten til den informasjonen.</w:t>
+      </w:r>
+      <w:r>
+        <w:rPr>
+          <w:rStyle w:val="normaltextrun"/>
+          <w:rFonts w:eastAsia="Times New Roman" w:cstheme="minorHAnsi"/>
+          <w:i/>
+          <w:iCs/>
+          <w:color w:val="000000" w:themeColor="text1"/>
+          <w:lang w:eastAsia="nb-NO"/>
+        </w:rPr>
+        <w:t xml:space="preserve"> JavaScript koden for det ble for det meste skrevet av den bygd inne AI botten pga. tids presset. </w:t>
+      </w:r>
     </w:p>
     <w:p>
       <w:pPr>
@@ -3855,6 +4881,16 @@
           <w:lang w:eastAsia="nb-NO"/>
         </w:rPr>
       </w:pPr>
+      <w:r>
+        <w:rPr>
+          <w:rStyle w:val="normaltextrun"/>
+          <w:rFonts w:ascii="Calibri Light" w:hAnsi="Calibri Light" w:cs="Calibri Light"/>
+          <w:color w:val="2F5496"/>
+          <w:sz w:val="32"/>
+          <w:szCs w:val="32"/>
+        </w:rPr>
+        <w:t xml:space="preserve"> </w:t>
+      </w:r>
       <w:r>
         <w:rPr>
           <w:rStyle w:val="normaltextrun"/>
@@ -4049,6 +5085,12 @@
                 <w:rFonts w:cstheme="minorHAnsi"/>
               </w:rPr>
             </w:pPr>
+            <w:r>
+              <w:rPr>
+                <w:rFonts w:cstheme="minorHAnsi"/>
+              </w:rPr>
+              <w:t>X</w:t>
+            </w:r>
           </w:p>
         </w:tc>
         <w:tc>
@@ -4131,6 +5173,12 @@
                 <w:rFonts w:cstheme="minorHAnsi"/>
               </w:rPr>
             </w:pPr>
+            <w:r>
+              <w:rPr>
+                <w:rFonts w:cstheme="minorHAnsi"/>
+              </w:rPr>
+              <w:t>X</w:t>
+            </w:r>
           </w:p>
         </w:tc>
         <w:tc>
@@ -4213,6 +5261,12 @@
                 <w:rFonts w:cstheme="minorHAnsi"/>
               </w:rPr>
             </w:pPr>
+            <w:r>
+              <w:rPr>
+                <w:rFonts w:cstheme="minorHAnsi"/>
+              </w:rPr>
+              <w:t>X</w:t>
+            </w:r>
           </w:p>
         </w:tc>
         <w:tc>
@@ -4369,6 +5423,30 @@
                 <w:lang w:eastAsia="nb-NO"/>
               </w:rPr>
             </w:pPr>
+            <w:r>
+              <w:rPr>
+                <w:rFonts w:ascii="Times New Roman" w:hAnsi="Times New Roman" w:cs="Times New Roman"/>
+              </w:rPr>
+              <w:t xml:space="preserve">Jeg føler at jeg har brukt tiden min godt på dette prosjektet </w:t>
+            </w:r>
+            <w:r>
+              <w:rPr>
+                <w:rFonts w:ascii="Times New Roman" w:hAnsi="Times New Roman" w:cs="Times New Roman"/>
+              </w:rPr>
+              <w:t>hovedsakelig fordi jeg planla ganske bra og viste alltid hva det var jeg måtte gjøre</w:t>
+            </w:r>
+            <w:r>
+              <w:rPr>
+                <w:rFonts w:ascii="Times New Roman" w:hAnsi="Times New Roman" w:cs="Times New Roman"/>
+              </w:rPr>
+              <w:t>. Det var en dag hvor jeg var ganske sliten å ikke fikk gjort veldig mye med annet en det så jobbet jeg alltid på prosjektet</w:t>
+            </w:r>
+            <w:r>
+              <w:rPr>
+                <w:rFonts w:ascii="Times New Roman" w:hAnsi="Times New Roman" w:cs="Times New Roman"/>
+              </w:rPr>
+              <w:t>.</w:t>
+            </w:r>
           </w:p>
         </w:tc>
         <w:tc>
@@ -4387,6 +5465,34 @@
         </w:tc>
       </w:tr>
     </w:tbl>
+    <w:p>
+      <w:pPr>
+        <w:pStyle w:val="paragraph"/>
+        <w:spacing w:before="0" w:beforeAutospacing="0" w:after="0" w:afterAutospacing="0"/>
+        <w:textAlignment w:val="baseline"/>
+        <w:rPr>
+          <w:rFonts w:ascii="Segoe UI" w:hAnsi="Segoe UI" w:cs="Segoe UI"/>
+          <w:i/>
+          <w:iCs/>
+          <w:sz w:val="18"/>
+          <w:szCs w:val="18"/>
+        </w:rPr>
+      </w:pPr>
+    </w:p>
+    <w:p>
+      <w:pPr>
+        <w:pStyle w:val="paragraph"/>
+        <w:spacing w:before="0" w:beforeAutospacing="0" w:after="0" w:afterAutospacing="0"/>
+        <w:textAlignment w:val="baseline"/>
+        <w:rPr>
+          <w:rFonts w:ascii="Segoe UI" w:hAnsi="Segoe UI" w:cs="Segoe UI"/>
+          <w:i/>
+          <w:iCs/>
+          <w:sz w:val="18"/>
+          <w:szCs w:val="18"/>
+        </w:rPr>
+      </w:pPr>
+    </w:p>
     <w:p>
       <w:pPr>
         <w:pStyle w:val="paragraph"/>
@@ -4747,7 +5853,84 @@
                 <w:rFonts w:eastAsia="Times New Roman" w:cstheme="minorHAnsi"/>
                 <w:lang w:eastAsia="nb-NO"/>
               </w:rPr>
-              <w:t>Skriv her..</w:t>
+              <w:t xml:space="preserve">Jeg tenker at jeg </w:t>
+            </w:r>
+            <w:r>
+              <w:rPr>
+                <w:rFonts w:eastAsia="Times New Roman" w:cstheme="minorHAnsi"/>
+                <w:lang w:eastAsia="nb-NO"/>
+              </w:rPr>
+              <w:t xml:space="preserve">har laget en nettside som ikke bare er </w:t>
+            </w:r>
+            <w:r>
+              <w:rPr>
+                <w:rFonts w:eastAsia="Times New Roman" w:cstheme="minorHAnsi"/>
+                <w:lang w:eastAsia="nb-NO"/>
+              </w:rPr>
+              <w:t>ganske</w:t>
+            </w:r>
+            <w:r>
+              <w:rPr>
+                <w:rFonts w:eastAsia="Times New Roman" w:cstheme="minorHAnsi"/>
+                <w:lang w:eastAsia="nb-NO"/>
+              </w:rPr>
+              <w:t xml:space="preserve"> </w:t>
+            </w:r>
+            <w:r>
+              <w:rPr>
+                <w:rFonts w:eastAsia="Times New Roman" w:cstheme="minorHAnsi"/>
+                <w:lang w:eastAsia="nb-NO"/>
+              </w:rPr>
+              <w:t>pen,</w:t>
+            </w:r>
+            <w:r>
+              <w:rPr>
+                <w:rFonts w:eastAsia="Times New Roman" w:cstheme="minorHAnsi"/>
+                <w:lang w:eastAsia="nb-NO"/>
+              </w:rPr>
+              <w:t xml:space="preserve"> men også </w:t>
+            </w:r>
+            <w:r>
+              <w:rPr>
+                <w:rFonts w:eastAsia="Times New Roman" w:cstheme="minorHAnsi"/>
+                <w:lang w:eastAsia="nb-NO"/>
+              </w:rPr>
+              <w:t xml:space="preserve">en som </w:t>
+            </w:r>
+            <w:r>
+              <w:rPr>
+                <w:rFonts w:eastAsia="Times New Roman" w:cstheme="minorHAnsi"/>
+                <w:lang w:eastAsia="nb-NO"/>
+              </w:rPr>
+              <w:t>fun</w:t>
+            </w:r>
+            <w:r>
+              <w:rPr>
+                <w:rFonts w:eastAsia="Times New Roman" w:cstheme="minorHAnsi"/>
+                <w:lang w:eastAsia="nb-NO"/>
+              </w:rPr>
+              <w:t>gerer</w:t>
+            </w:r>
+            <w:r>
+              <w:rPr>
+                <w:rFonts w:eastAsia="Times New Roman" w:cstheme="minorHAnsi"/>
+                <w:lang w:eastAsia="nb-NO"/>
+              </w:rPr>
+              <w:t xml:space="preserve"> ganske bra. Den er også veldig responsive å skal fungere for alle mulige </w:t>
+            </w:r>
+            <w:r>
+              <w:rPr>
+                <w:rFonts w:eastAsia="Times New Roman" w:cstheme="minorHAnsi"/>
+                <w:lang w:eastAsia="nb-NO"/>
+              </w:rPr>
+              <w:t>enheter</w:t>
+            </w:r>
+            <w:r>
+              <w:rPr>
+                <w:rFonts w:eastAsia="Times New Roman" w:cstheme="minorHAnsi"/>
+                <w:lang w:eastAsia="nb-NO"/>
+              </w:rPr>
+              <w:t xml:space="preserve"> (Det er her å JavaScript hvor mye av tiden gikk)</w:t>
             </w:r>
           </w:p>
         </w:tc>
@@ -4807,6 +5990,7 @@
           <w:szCs w:val="32"/>
           <w:lang w:eastAsia="nb-NO"/>
         </w:rPr>
+        <w:lastRenderedPageBreak/>
         <w:t>Egen læring</w:t>
       </w:r>
       <w:r>
@@ -4923,7 +6107,6 @@
         <w:pStyle w:val="Heading1"/>
       </w:pPr>
       <w:r>
-        <w:lastRenderedPageBreak/>
         <w:t>Fylles ut ved PROSJEKTETS slutt</w:t>
       </w:r>
     </w:p>
@@ -5086,8 +6269,8 @@
     </w:tbl>
     <w:p/>
     <w:sectPr>
-      <w:headerReference w:type="default" r:id="rId28"/>
-      <w:footerReference w:type="default" r:id="rId29"/>
+      <w:headerReference w:type="default" r:id="rId35"/>
+      <w:footerReference w:type="default" r:id="rId36"/>
       <w:pgSz w:w="11906" w:h="16838"/>
       <w:pgMar w:top="1440" w:right="1440" w:bottom="1440" w:left="1440" w:header="708" w:footer="708" w:gutter="0"/>
       <w:cols w:space="708"/>
@@ -5965,6 +7148,7 @@
   <w:style w:type="character" w:default="1" w:styleId="DefaultParagraphFont">
     <w:name w:val="Default Paragraph Font"/>
     <w:uiPriority w:val="1"/>
+    <w:semiHidden/>
     <w:unhideWhenUsed/>
   </w:style>
   <w:style w:type="table" w:default="1" w:styleId="TableNormal">
@@ -7008,12 +8192,7 @@
 </file>
 
 <file path=customXml/item2.xml><?xml version="1.0" encoding="utf-8"?>
-<?mso-contentType ?>
-<FormTemplates xmlns="http://schemas.microsoft.com/sharepoint/v3/contenttype/forms">
-  <Display>DocumentLibraryForm</Display>
-  <Edit>DocumentLibraryForm</Edit>
-  <New>DocumentLibraryForm</New>
-</FormTemplates>
+<b:Sources xmlns:b="http://schemas.openxmlformats.org/officeDocument/2006/bibliography" xmlns="http://schemas.openxmlformats.org/officeDocument/2006/bibliography" SelectedStyle="\APASixthEditionOfficeOnline.xsl" StyleName="APA" Version="6"/>
 </file>
 
 <file path=customXml/item3.xml><?xml version="1.0" encoding="utf-8"?>
@@ -7028,7 +8207,12 @@
 </file>
 
 <file path=customXml/item4.xml><?xml version="1.0" encoding="utf-8"?>
-<b:Sources xmlns:b="http://schemas.openxmlformats.org/officeDocument/2006/bibliography" xmlns="http://schemas.openxmlformats.org/officeDocument/2006/bibliography" SelectedStyle="\APASixthEditionOfficeOnline.xsl" StyleName="APA" Version="6"/>
+<?mso-contentType ?>
+<FormTemplates xmlns="http://schemas.microsoft.com/sharepoint/v3/contenttype/forms">
+  <Display>DocumentLibraryForm</Display>
+  <Edit>DocumentLibraryForm</Edit>
+  <New>DocumentLibraryForm</New>
+</FormTemplates>
 </file>
 
 <file path=customXml/itemProps1.xml><?xml version="1.0" encoding="utf-8"?>
@@ -7051,9 +8235,9 @@
 </file>
 
 <file path=customXml/itemProps2.xml><?xml version="1.0" encoding="utf-8"?>
-<ds:datastoreItem xmlns:ds="http://schemas.openxmlformats.org/officeDocument/2006/customXml" ds:itemID="{5E6E0DA3-EA58-4CEE-9442-E2DD0B135720}">
+<ds:datastoreItem xmlns:ds="http://schemas.openxmlformats.org/officeDocument/2006/customXml" ds:itemID="{663935FD-5C41-43E8-B646-D2D50EC6ECB5}">
   <ds:schemaRefs>
-    <ds:schemaRef ds:uri="http://schemas.microsoft.com/sharepoint/v3/contenttype/forms"/>
+    <ds:schemaRef ds:uri="http://schemas.openxmlformats.org/officeDocument/2006/bibliography"/>
   </ds:schemaRefs>
 </ds:datastoreItem>
 </file>
@@ -7070,9 +8254,9 @@
 </file>
 
 <file path=customXml/itemProps4.xml><?xml version="1.0" encoding="utf-8"?>
-<ds:datastoreItem xmlns:ds="http://schemas.openxmlformats.org/officeDocument/2006/customXml" ds:itemID="{663935FD-5C41-43E8-B646-D2D50EC6ECB5}">
+<ds:datastoreItem xmlns:ds="http://schemas.openxmlformats.org/officeDocument/2006/customXml" ds:itemID="{5E6E0DA3-EA58-4CEE-9442-E2DD0B135720}">
   <ds:schemaRefs>
-    <ds:schemaRef ds:uri="http://schemas.openxmlformats.org/officeDocument/2006/bibliography"/>
+    <ds:schemaRef ds:uri="http://schemas.microsoft.com/sharepoint/v3/contenttype/forms"/>
   </ds:schemaRefs>
 </ds:datastoreItem>
 </file>
</xml_diff>